<commit_message>
numerous files added and updated
</commit_message>
<xml_diff>
--- a/[Java-Spring] Software Security/Software Security Report.docx
+++ b/[Java-Spring] Software Security/Software Security Report.docx
@@ -1,6 +1,6 @@
 
 <file path=word/document.xml><?xml version="1.0" encoding="utf-8"?>
-<w:document xmlns:wpc="http://schemas.microsoft.com/office/word/2010/wordprocessingCanvas" xmlns:cx="http://schemas.microsoft.com/office/drawing/2014/chartex" xmlns:cx1="http://schemas.microsoft.com/office/drawing/2015/9/8/chartex" xmlns:cx2="http://schemas.microsoft.com/office/drawing/2015/10/21/chartex" xmlns:cx3="http://schemas.microsoft.com/office/drawing/2016/5/9/chartex" xmlns:cx4="http://schemas.microsoft.com/office/drawing/2016/5/10/chartex" xmlns:cx5="http://schemas.microsoft.com/office/drawing/2016/5/11/chartex" xmlns:cx6="http://schemas.microsoft.com/office/drawing/2016/5/12/chartex" xmlns:cx7="http://schemas.microsoft.com/office/drawing/2016/5/13/chartex" xmlns:cx8="http://schemas.microsoft.com/office/drawing/2016/5/14/chartex" xmlns:mc="http://schemas.openxmlformats.org/markup-compatibility/2006" xmlns:aink="http://schemas.microsoft.com/office/drawing/2016/ink" xmlns:am3d="http://schemas.microsoft.com/office/drawing/2017/model3d" xmlns:o="urn:schemas-microsoft-com:office:office" xmlns:oel="http://schemas.microsoft.com/office/2019/extlst" xmlns:r="http://schemas.openxmlformats.org/officeDocument/2006/relationships" xmlns:m="http://schemas.openxmlformats.org/officeDocument/2006/math" xmlns:v="urn:schemas-microsoft-com:vml" xmlns:wp14="http://schemas.microsoft.com/office/word/2010/wordprocessingDrawing" xmlns:wp="http://schemas.openxmlformats.org/drawingml/2006/wordprocessingDrawing" xmlns:w10="urn:schemas-microsoft-com:office:word" xmlns:w="http://schemas.openxmlformats.org/wordprocessingml/2006/main" xmlns:w14="http://schemas.microsoft.com/office/word/2010/wordml" xmlns:w15="http://schemas.microsoft.com/office/word/2012/wordml" xmlns:w16cex="http://schemas.microsoft.com/office/word/2018/wordml/cex" xmlns:w16cid="http://schemas.microsoft.com/office/word/2016/wordml/cid" xmlns:w16="http://schemas.microsoft.com/office/word/2018/wordml" xmlns:w16sdtdh="http://schemas.microsoft.com/office/word/2020/wordml/sdtdatahash" xmlns:w16se="http://schemas.microsoft.com/office/word/2015/wordml/symex" xmlns:wpg="http://schemas.microsoft.com/office/word/2010/wordprocessingGroup" xmlns:wpi="http://schemas.microsoft.com/office/word/2010/wordprocessingInk" xmlns:wne="http://schemas.microsoft.com/office/word/2006/wordml" xmlns:wps="http://schemas.microsoft.com/office/word/2010/wordprocessingShape" mc:Ignorable="w14 w15 w16se w16cid w16 w16cex w16sdtdh wp14">
+<w:document xmlns:wpc="http://schemas.microsoft.com/office/word/2010/wordprocessingCanvas" xmlns:cx="http://schemas.microsoft.com/office/drawing/2014/chartex" xmlns:cx1="http://schemas.microsoft.com/office/drawing/2015/9/8/chartex" xmlns:cx2="http://schemas.microsoft.com/office/drawing/2015/10/21/chartex" xmlns:cx3="http://schemas.microsoft.com/office/drawing/2016/5/9/chartex" xmlns:cx4="http://schemas.microsoft.com/office/drawing/2016/5/10/chartex" xmlns:cx5="http://schemas.microsoft.com/office/drawing/2016/5/11/chartex" xmlns:cx6="http://schemas.microsoft.com/office/drawing/2016/5/12/chartex" xmlns:cx7="http://schemas.microsoft.com/office/drawing/2016/5/13/chartex" xmlns:cx8="http://schemas.microsoft.com/office/drawing/2016/5/14/chartex" xmlns:mc="http://schemas.openxmlformats.org/markup-compatibility/2006" xmlns:aink="http://schemas.microsoft.com/office/drawing/2016/ink" xmlns:am3d="http://schemas.microsoft.com/office/drawing/2017/model3d" xmlns:o="urn:schemas-microsoft-com:office:office" xmlns:oel="http://schemas.microsoft.com/office/2019/extlst" xmlns:r="http://schemas.openxmlformats.org/officeDocument/2006/relationships" xmlns:m="http://schemas.openxmlformats.org/officeDocument/2006/math" xmlns:v="urn:schemas-microsoft-com:vml" xmlns:wp14="http://schemas.microsoft.com/office/word/2010/wordprocessingDrawing" xmlns:wp="http://schemas.openxmlformats.org/drawingml/2006/wordprocessingDrawing" xmlns:w10="urn:schemas-microsoft-com:office:word" xmlns:w="http://schemas.openxmlformats.org/wordprocessingml/2006/main" xmlns:w14="http://schemas.microsoft.com/office/word/2010/wordml" xmlns:w15="http://schemas.microsoft.com/office/word/2012/wordml" xmlns:w16cex="http://schemas.microsoft.com/office/word/2018/wordml/cex" xmlns:w16cid="http://schemas.microsoft.com/office/word/2016/wordml/cid" xmlns:w16="http://schemas.microsoft.com/office/word/2018/wordml" xmlns:w16du="http://schemas.microsoft.com/office/word/2023/wordml/word16du" xmlns:w16sdtdh="http://schemas.microsoft.com/office/word/2020/wordml/sdtdatahash" xmlns:w16se="http://schemas.microsoft.com/office/word/2015/wordml/symex" xmlns:wpg="http://schemas.microsoft.com/office/word/2010/wordprocessingGroup" xmlns:wpi="http://schemas.microsoft.com/office/word/2010/wordprocessingInk" xmlns:wne="http://schemas.microsoft.com/office/word/2006/wordml" xmlns:wps="http://schemas.microsoft.com/office/word/2010/wordprocessingShape" mc:Ignorable="w14 w15 w16se w16cid w16 w16cex w16sdtdh w16du wp14">
   <w:body>
     <w:p>
       <w:pPr>
@@ -227,7 +227,7 @@
         <w:rPr>
           <w:rFonts w:ascii="Times New Roman" w:hAnsi="Times New Roman" w:cs="Times New Roman"/>
         </w:rPr>
-        <w:t>Practices for Secure Software</w:t>
+        <w:t>Secure Software</w:t>
       </w:r>
       <w:r>
         <w:rPr>
@@ -3958,14 +3958,12 @@
         <w:lastRenderedPageBreak/>
         <w:t xml:space="preserve">Following industry standard best practices for secure coding is crucial </w:t>
       </w:r>
-      <w:proofErr w:type="gramStart"/>
       <w:r>
         <w:rPr>
           <w:rFonts w:ascii="Times New Roman" w:eastAsia="Times New Roman" w:hAnsi="Times New Roman" w:cs="Times New Roman"/>
         </w:rPr>
         <w:t>in order to</w:t>
       </w:r>
-      <w:proofErr w:type="gramEnd"/>
       <w:r>
         <w:rPr>
           <w:rFonts w:ascii="Times New Roman" w:eastAsia="Times New Roman" w:hAnsi="Times New Roman" w:cs="Times New Roman"/>
@@ -4616,7 +4614,7 @@
           <w:b/>
           <w:bCs/>
         </w:rPr>
-        <w:t>ATTACHMENT</w:t>
+        <w:t>FILE</w:t>
       </w:r>
       <w:r>
         <w:rPr>
@@ -4624,19 +4622,45 @@
           <w:b/>
           <w:bCs/>
         </w:rPr>
-        <w:t xml:space="preserve"> (ZIP)</w:t>
-      </w:r>
-      <w:r>
-        <w:rPr>
-          <w:rFonts w:ascii="Times New Roman" w:eastAsia="Times New Roman" w:hAnsi="Times New Roman" w:cs="Times New Roman"/>
-        </w:rPr>
-        <w:t>: The refactored (Java) code and the corresponding project (files) have been included in the attached ZIP file.</w:t>
-      </w:r>
-      <w:r>
-        <w:rPr>
-          <w:rFonts w:ascii="Times New Roman" w:eastAsia="Times New Roman" w:hAnsi="Times New Roman" w:cs="Times New Roman"/>
-        </w:rPr>
-        <w:t xml:space="preserve"> Additional project resource files, such as application.properties, keystore.jks, and suppression.xml) are located in ./src/main/resources/.</w:t>
+        <w:t xml:space="preserve"> CONTENTS</w:t>
+      </w:r>
+      <w:r>
+        <w:rPr>
+          <w:rFonts w:ascii="Times New Roman" w:eastAsia="Times New Roman" w:hAnsi="Times New Roman" w:cs="Times New Roman"/>
+        </w:rPr>
+        <w:t>: The refactored Java code and the corresponding project files have been included.</w:t>
+      </w:r>
+      <w:r>
+        <w:rPr>
+          <w:rFonts w:ascii="Times New Roman" w:eastAsia="Times New Roman" w:hAnsi="Times New Roman" w:cs="Times New Roman"/>
+        </w:rPr>
+        <w:t xml:space="preserve"> Additional project resource files, such as application.properties, keystore.jks, and suppression.xml</w:t>
+      </w:r>
+      <w:r>
+        <w:rPr>
+          <w:rFonts w:ascii="Times New Roman" w:eastAsia="Times New Roman" w:hAnsi="Times New Roman" w:cs="Times New Roman"/>
+        </w:rPr>
+        <w:t>,</w:t>
+      </w:r>
+      <w:r>
+        <w:rPr>
+          <w:rFonts w:ascii="Times New Roman" w:eastAsia="Times New Roman" w:hAnsi="Times New Roman" w:cs="Times New Roman"/>
+        </w:rPr>
+        <w:t xml:space="preserve"> are located in </w:t>
+      </w:r>
+      <w:r>
+        <w:rPr>
+          <w:rFonts w:ascii="Times New Roman" w:eastAsia="Times New Roman" w:hAnsi="Times New Roman" w:cs="Times New Roman"/>
+          <w:i/>
+          <w:iCs/>
+        </w:rPr>
+        <w:t>./src/main/resources/</w:t>
+      </w:r>
+      <w:r>
+        <w:rPr>
+          <w:rFonts w:ascii="Times New Roman" w:eastAsia="Times New Roman" w:hAnsi="Times New Roman" w:cs="Times New Roman"/>
+        </w:rPr>
+        <w:t>.</w:t>
       </w:r>
       <w:r>
         <w:rPr>
@@ -4654,7 +4678,15 @@
         <w:rPr>
           <w:rFonts w:ascii="Times New Roman" w:eastAsia="Times New Roman" w:hAnsi="Times New Roman" w:cs="Times New Roman"/>
         </w:rPr>
-        <w:t>./target/</w:t>
+        <w:t>.</w:t>
+      </w:r>
+      <w:r>
+        <w:rPr>
+          <w:rFonts w:ascii="Times New Roman" w:eastAsia="Times New Roman" w:hAnsi="Times New Roman" w:cs="Times New Roman"/>
+          <w:i/>
+          <w:iCs/>
+        </w:rPr>
+        <w:t>/target/</w:t>
       </w:r>
       <w:r>
         <w:rPr>
@@ -4691,7 +4723,7 @@
 </file>
 
 <file path=word/endnotes.xml><?xml version="1.0" encoding="utf-8"?>
-<w:endnotes xmlns:wpc="http://schemas.microsoft.com/office/word/2010/wordprocessingCanvas" xmlns:cx="http://schemas.microsoft.com/office/drawing/2014/chartex" xmlns:cx1="http://schemas.microsoft.com/office/drawing/2015/9/8/chartex" xmlns:cx2="http://schemas.microsoft.com/office/drawing/2015/10/21/chartex" xmlns:cx3="http://schemas.microsoft.com/office/drawing/2016/5/9/chartex" xmlns:cx4="http://schemas.microsoft.com/office/drawing/2016/5/10/chartex" xmlns:cx5="http://schemas.microsoft.com/office/drawing/2016/5/11/chartex" xmlns:cx6="http://schemas.microsoft.com/office/drawing/2016/5/12/chartex" xmlns:cx7="http://schemas.microsoft.com/office/drawing/2016/5/13/chartex" xmlns:cx8="http://schemas.microsoft.com/office/drawing/2016/5/14/chartex" xmlns:mc="http://schemas.openxmlformats.org/markup-compatibility/2006" xmlns:aink="http://schemas.microsoft.com/office/drawing/2016/ink" xmlns:am3d="http://schemas.microsoft.com/office/drawing/2017/model3d" xmlns:o="urn:schemas-microsoft-com:office:office" xmlns:oel="http://schemas.microsoft.com/office/2019/extlst" xmlns:r="http://schemas.openxmlformats.org/officeDocument/2006/relationships" xmlns:m="http://schemas.openxmlformats.org/officeDocument/2006/math" xmlns:v="urn:schemas-microsoft-com:vml" xmlns:wp14="http://schemas.microsoft.com/office/word/2010/wordprocessingDrawing" xmlns:wp="http://schemas.openxmlformats.org/drawingml/2006/wordprocessingDrawing" xmlns:w10="urn:schemas-microsoft-com:office:word" xmlns:w="http://schemas.openxmlformats.org/wordprocessingml/2006/main" xmlns:w14="http://schemas.microsoft.com/office/word/2010/wordml" xmlns:w15="http://schemas.microsoft.com/office/word/2012/wordml" xmlns:w16cex="http://schemas.microsoft.com/office/word/2018/wordml/cex" xmlns:w16cid="http://schemas.microsoft.com/office/word/2016/wordml/cid" xmlns:w16="http://schemas.microsoft.com/office/word/2018/wordml" xmlns:w16sdtdh="http://schemas.microsoft.com/office/word/2020/wordml/sdtdatahash" xmlns:w16se="http://schemas.microsoft.com/office/word/2015/wordml/symex" xmlns:wpg="http://schemas.microsoft.com/office/word/2010/wordprocessingGroup" xmlns:wpi="http://schemas.microsoft.com/office/word/2010/wordprocessingInk" xmlns:wne="http://schemas.microsoft.com/office/word/2006/wordml" xmlns:wps="http://schemas.microsoft.com/office/word/2010/wordprocessingShape" mc:Ignorable="w14 w15 w16se w16cid w16 w16cex w16sdtdh wp14">
+<w:endnotes xmlns:wpc="http://schemas.microsoft.com/office/word/2010/wordprocessingCanvas" xmlns:cx="http://schemas.microsoft.com/office/drawing/2014/chartex" xmlns:cx1="http://schemas.microsoft.com/office/drawing/2015/9/8/chartex" xmlns:cx2="http://schemas.microsoft.com/office/drawing/2015/10/21/chartex" xmlns:cx3="http://schemas.microsoft.com/office/drawing/2016/5/9/chartex" xmlns:cx4="http://schemas.microsoft.com/office/drawing/2016/5/10/chartex" xmlns:cx5="http://schemas.microsoft.com/office/drawing/2016/5/11/chartex" xmlns:cx6="http://schemas.microsoft.com/office/drawing/2016/5/12/chartex" xmlns:cx7="http://schemas.microsoft.com/office/drawing/2016/5/13/chartex" xmlns:cx8="http://schemas.microsoft.com/office/drawing/2016/5/14/chartex" xmlns:mc="http://schemas.openxmlformats.org/markup-compatibility/2006" xmlns:aink="http://schemas.microsoft.com/office/drawing/2016/ink" xmlns:am3d="http://schemas.microsoft.com/office/drawing/2017/model3d" xmlns:o="urn:schemas-microsoft-com:office:office" xmlns:oel="http://schemas.microsoft.com/office/2019/extlst" xmlns:r="http://schemas.openxmlformats.org/officeDocument/2006/relationships" xmlns:m="http://schemas.openxmlformats.org/officeDocument/2006/math" xmlns:v="urn:schemas-microsoft-com:vml" xmlns:wp14="http://schemas.microsoft.com/office/word/2010/wordprocessingDrawing" xmlns:wp="http://schemas.openxmlformats.org/drawingml/2006/wordprocessingDrawing" xmlns:w10="urn:schemas-microsoft-com:office:word" xmlns:w="http://schemas.openxmlformats.org/wordprocessingml/2006/main" xmlns:w14="http://schemas.microsoft.com/office/word/2010/wordml" xmlns:w15="http://schemas.microsoft.com/office/word/2012/wordml" xmlns:w16cex="http://schemas.microsoft.com/office/word/2018/wordml/cex" xmlns:w16cid="http://schemas.microsoft.com/office/word/2016/wordml/cid" xmlns:w16="http://schemas.microsoft.com/office/word/2018/wordml" xmlns:w16du="http://schemas.microsoft.com/office/word/2023/wordml/word16du" xmlns:w16sdtdh="http://schemas.microsoft.com/office/word/2020/wordml/sdtdatahash" xmlns:w16se="http://schemas.microsoft.com/office/word/2015/wordml/symex" xmlns:wpg="http://schemas.microsoft.com/office/word/2010/wordprocessingGroup" xmlns:wpi="http://schemas.microsoft.com/office/word/2010/wordprocessingInk" xmlns:wne="http://schemas.microsoft.com/office/word/2006/wordml" xmlns:wps="http://schemas.microsoft.com/office/word/2010/wordprocessingShape" mc:Ignorable="w14 w15 w16se w16cid w16 w16cex w16sdtdh w16du wp14">
   <w:endnote w:type="separator" w:id="-1">
     <w:p>
       <w:r>
@@ -4713,7 +4745,7 @@
 </file>
 
 <file path=word/footer1.xml><?xml version="1.0" encoding="utf-8"?>
-<w:ftr xmlns:wpc="http://schemas.microsoft.com/office/word/2010/wordprocessingCanvas" xmlns:cx="http://schemas.microsoft.com/office/drawing/2014/chartex" xmlns:cx1="http://schemas.microsoft.com/office/drawing/2015/9/8/chartex" xmlns:cx2="http://schemas.microsoft.com/office/drawing/2015/10/21/chartex" xmlns:cx3="http://schemas.microsoft.com/office/drawing/2016/5/9/chartex" xmlns:cx4="http://schemas.microsoft.com/office/drawing/2016/5/10/chartex" xmlns:cx5="http://schemas.microsoft.com/office/drawing/2016/5/11/chartex" xmlns:cx6="http://schemas.microsoft.com/office/drawing/2016/5/12/chartex" xmlns:cx7="http://schemas.microsoft.com/office/drawing/2016/5/13/chartex" xmlns:cx8="http://schemas.microsoft.com/office/drawing/2016/5/14/chartex" xmlns:mc="http://schemas.openxmlformats.org/markup-compatibility/2006" xmlns:aink="http://schemas.microsoft.com/office/drawing/2016/ink" xmlns:am3d="http://schemas.microsoft.com/office/drawing/2017/model3d" xmlns:o="urn:schemas-microsoft-com:office:office" xmlns:oel="http://schemas.microsoft.com/office/2019/extlst" xmlns:r="http://schemas.openxmlformats.org/officeDocument/2006/relationships" xmlns:m="http://schemas.openxmlformats.org/officeDocument/2006/math" xmlns:v="urn:schemas-microsoft-com:vml" xmlns:wp14="http://schemas.microsoft.com/office/word/2010/wordprocessingDrawing" xmlns:wp="http://schemas.openxmlformats.org/drawingml/2006/wordprocessingDrawing" xmlns:w10="urn:schemas-microsoft-com:office:word" xmlns:w="http://schemas.openxmlformats.org/wordprocessingml/2006/main" xmlns:w14="http://schemas.microsoft.com/office/word/2010/wordml" xmlns:w15="http://schemas.microsoft.com/office/word/2012/wordml" xmlns:w16cex="http://schemas.microsoft.com/office/word/2018/wordml/cex" xmlns:w16cid="http://schemas.microsoft.com/office/word/2016/wordml/cid" xmlns:w16="http://schemas.microsoft.com/office/word/2018/wordml" xmlns:w16sdtdh="http://schemas.microsoft.com/office/word/2020/wordml/sdtdatahash" xmlns:w16se="http://schemas.microsoft.com/office/word/2015/wordml/symex" xmlns:wpg="http://schemas.microsoft.com/office/word/2010/wordprocessingGroup" xmlns:wpi="http://schemas.microsoft.com/office/word/2010/wordprocessingInk" xmlns:wne="http://schemas.microsoft.com/office/word/2006/wordml" xmlns:wps="http://schemas.microsoft.com/office/word/2010/wordprocessingShape" mc:Ignorable="w14 w15 w16se w16cid w16 w16cex w16sdtdh wp14">
+<w:ftr xmlns:wpc="http://schemas.microsoft.com/office/word/2010/wordprocessingCanvas" xmlns:cx="http://schemas.microsoft.com/office/drawing/2014/chartex" xmlns:cx1="http://schemas.microsoft.com/office/drawing/2015/9/8/chartex" xmlns:cx2="http://schemas.microsoft.com/office/drawing/2015/10/21/chartex" xmlns:cx3="http://schemas.microsoft.com/office/drawing/2016/5/9/chartex" xmlns:cx4="http://schemas.microsoft.com/office/drawing/2016/5/10/chartex" xmlns:cx5="http://schemas.microsoft.com/office/drawing/2016/5/11/chartex" xmlns:cx6="http://schemas.microsoft.com/office/drawing/2016/5/12/chartex" xmlns:cx7="http://schemas.microsoft.com/office/drawing/2016/5/13/chartex" xmlns:cx8="http://schemas.microsoft.com/office/drawing/2016/5/14/chartex" xmlns:mc="http://schemas.openxmlformats.org/markup-compatibility/2006" xmlns:aink="http://schemas.microsoft.com/office/drawing/2016/ink" xmlns:am3d="http://schemas.microsoft.com/office/drawing/2017/model3d" xmlns:o="urn:schemas-microsoft-com:office:office" xmlns:oel="http://schemas.microsoft.com/office/2019/extlst" xmlns:r="http://schemas.openxmlformats.org/officeDocument/2006/relationships" xmlns:m="http://schemas.openxmlformats.org/officeDocument/2006/math" xmlns:v="urn:schemas-microsoft-com:vml" xmlns:wp14="http://schemas.microsoft.com/office/word/2010/wordprocessingDrawing" xmlns:wp="http://schemas.openxmlformats.org/drawingml/2006/wordprocessingDrawing" xmlns:w10="urn:schemas-microsoft-com:office:word" xmlns:w="http://schemas.openxmlformats.org/wordprocessingml/2006/main" xmlns:w14="http://schemas.microsoft.com/office/word/2010/wordml" xmlns:w15="http://schemas.microsoft.com/office/word/2012/wordml" xmlns:w16cex="http://schemas.microsoft.com/office/word/2018/wordml/cex" xmlns:w16cid="http://schemas.microsoft.com/office/word/2016/wordml/cid" xmlns:w16="http://schemas.microsoft.com/office/word/2018/wordml" xmlns:w16du="http://schemas.microsoft.com/office/word/2023/wordml/word16du" xmlns:w16sdtdh="http://schemas.microsoft.com/office/word/2020/wordml/sdtdatahash" xmlns:w16se="http://schemas.microsoft.com/office/word/2015/wordml/symex" xmlns:wpg="http://schemas.microsoft.com/office/word/2010/wordprocessingGroup" xmlns:wpi="http://schemas.microsoft.com/office/word/2010/wordprocessingInk" xmlns:wne="http://schemas.microsoft.com/office/word/2006/wordml" xmlns:wps="http://schemas.microsoft.com/office/word/2010/wordprocessingShape" mc:Ignorable="w14 w15 w16se w16cid w16 w16cex w16sdtdh w16du wp14">
   <w:p>
     <w:pPr>
       <w:pStyle w:val="Footer"/>
@@ -4750,7 +4782,7 @@
 </file>
 
 <file path=word/footer2.xml><?xml version="1.0" encoding="utf-8"?>
-<w:ftr xmlns:wpc="http://schemas.microsoft.com/office/word/2010/wordprocessingCanvas" xmlns:cx="http://schemas.microsoft.com/office/drawing/2014/chartex" xmlns:cx1="http://schemas.microsoft.com/office/drawing/2015/9/8/chartex" xmlns:cx2="http://schemas.microsoft.com/office/drawing/2015/10/21/chartex" xmlns:cx3="http://schemas.microsoft.com/office/drawing/2016/5/9/chartex" xmlns:cx4="http://schemas.microsoft.com/office/drawing/2016/5/10/chartex" xmlns:cx5="http://schemas.microsoft.com/office/drawing/2016/5/11/chartex" xmlns:cx6="http://schemas.microsoft.com/office/drawing/2016/5/12/chartex" xmlns:cx7="http://schemas.microsoft.com/office/drawing/2016/5/13/chartex" xmlns:cx8="http://schemas.microsoft.com/office/drawing/2016/5/14/chartex" xmlns:mc="http://schemas.openxmlformats.org/markup-compatibility/2006" xmlns:aink="http://schemas.microsoft.com/office/drawing/2016/ink" xmlns:am3d="http://schemas.microsoft.com/office/drawing/2017/model3d" xmlns:o="urn:schemas-microsoft-com:office:office" xmlns:oel="http://schemas.microsoft.com/office/2019/extlst" xmlns:r="http://schemas.openxmlformats.org/officeDocument/2006/relationships" xmlns:m="http://schemas.openxmlformats.org/officeDocument/2006/math" xmlns:v="urn:schemas-microsoft-com:vml" xmlns:wp14="http://schemas.microsoft.com/office/word/2010/wordprocessingDrawing" xmlns:wp="http://schemas.openxmlformats.org/drawingml/2006/wordprocessingDrawing" xmlns:w10="urn:schemas-microsoft-com:office:word" xmlns:w="http://schemas.openxmlformats.org/wordprocessingml/2006/main" xmlns:w14="http://schemas.microsoft.com/office/word/2010/wordml" xmlns:w15="http://schemas.microsoft.com/office/word/2012/wordml" xmlns:w16cex="http://schemas.microsoft.com/office/word/2018/wordml/cex" xmlns:w16cid="http://schemas.microsoft.com/office/word/2016/wordml/cid" xmlns:w16="http://schemas.microsoft.com/office/word/2018/wordml" xmlns:w16sdtdh="http://schemas.microsoft.com/office/word/2020/wordml/sdtdatahash" xmlns:w16se="http://schemas.microsoft.com/office/word/2015/wordml/symex" xmlns:wpg="http://schemas.microsoft.com/office/word/2010/wordprocessingGroup" xmlns:wpi="http://schemas.microsoft.com/office/word/2010/wordprocessingInk" xmlns:wne="http://schemas.microsoft.com/office/word/2006/wordml" xmlns:wps="http://schemas.microsoft.com/office/word/2010/wordprocessingShape" mc:Ignorable="w14 w15 w16se w16cid w16 w16cex w16sdtdh wp14">
+<w:ftr xmlns:wpc="http://schemas.microsoft.com/office/word/2010/wordprocessingCanvas" xmlns:cx="http://schemas.microsoft.com/office/drawing/2014/chartex" xmlns:cx1="http://schemas.microsoft.com/office/drawing/2015/9/8/chartex" xmlns:cx2="http://schemas.microsoft.com/office/drawing/2015/10/21/chartex" xmlns:cx3="http://schemas.microsoft.com/office/drawing/2016/5/9/chartex" xmlns:cx4="http://schemas.microsoft.com/office/drawing/2016/5/10/chartex" xmlns:cx5="http://schemas.microsoft.com/office/drawing/2016/5/11/chartex" xmlns:cx6="http://schemas.microsoft.com/office/drawing/2016/5/12/chartex" xmlns:cx7="http://schemas.microsoft.com/office/drawing/2016/5/13/chartex" xmlns:cx8="http://schemas.microsoft.com/office/drawing/2016/5/14/chartex" xmlns:mc="http://schemas.openxmlformats.org/markup-compatibility/2006" xmlns:aink="http://schemas.microsoft.com/office/drawing/2016/ink" xmlns:am3d="http://schemas.microsoft.com/office/drawing/2017/model3d" xmlns:o="urn:schemas-microsoft-com:office:office" xmlns:oel="http://schemas.microsoft.com/office/2019/extlst" xmlns:r="http://schemas.openxmlformats.org/officeDocument/2006/relationships" xmlns:m="http://schemas.openxmlformats.org/officeDocument/2006/math" xmlns:v="urn:schemas-microsoft-com:vml" xmlns:wp14="http://schemas.microsoft.com/office/word/2010/wordprocessingDrawing" xmlns:wp="http://schemas.openxmlformats.org/drawingml/2006/wordprocessingDrawing" xmlns:w10="urn:schemas-microsoft-com:office:word" xmlns:w="http://schemas.openxmlformats.org/wordprocessingml/2006/main" xmlns:w14="http://schemas.microsoft.com/office/word/2010/wordml" xmlns:w15="http://schemas.microsoft.com/office/word/2012/wordml" xmlns:w16cex="http://schemas.microsoft.com/office/word/2018/wordml/cex" xmlns:w16cid="http://schemas.microsoft.com/office/word/2016/wordml/cid" xmlns:w16="http://schemas.microsoft.com/office/word/2018/wordml" xmlns:w16du="http://schemas.microsoft.com/office/word/2023/wordml/word16du" xmlns:w16sdtdh="http://schemas.microsoft.com/office/word/2020/wordml/sdtdatahash" xmlns:w16se="http://schemas.microsoft.com/office/word/2015/wordml/symex" xmlns:wpg="http://schemas.microsoft.com/office/word/2010/wordprocessingGroup" xmlns:wpi="http://schemas.microsoft.com/office/word/2010/wordprocessingInk" xmlns:wne="http://schemas.microsoft.com/office/word/2006/wordml" xmlns:wps="http://schemas.microsoft.com/office/word/2010/wordprocessingShape" mc:Ignorable="w14 w15 w16se w16cid w16 w16cex w16sdtdh w16du wp14">
   <w:sdt>
     <w:sdtPr>
       <w:rPr>
@@ -4814,7 +4846,7 @@
 </file>
 
 <file path=word/footnotes.xml><?xml version="1.0" encoding="utf-8"?>
-<w:footnotes xmlns:wpc="http://schemas.microsoft.com/office/word/2010/wordprocessingCanvas" xmlns:cx="http://schemas.microsoft.com/office/drawing/2014/chartex" xmlns:cx1="http://schemas.microsoft.com/office/drawing/2015/9/8/chartex" xmlns:cx2="http://schemas.microsoft.com/office/drawing/2015/10/21/chartex" xmlns:cx3="http://schemas.microsoft.com/office/drawing/2016/5/9/chartex" xmlns:cx4="http://schemas.microsoft.com/office/drawing/2016/5/10/chartex" xmlns:cx5="http://schemas.microsoft.com/office/drawing/2016/5/11/chartex" xmlns:cx6="http://schemas.microsoft.com/office/drawing/2016/5/12/chartex" xmlns:cx7="http://schemas.microsoft.com/office/drawing/2016/5/13/chartex" xmlns:cx8="http://schemas.microsoft.com/office/drawing/2016/5/14/chartex" xmlns:mc="http://schemas.openxmlformats.org/markup-compatibility/2006" xmlns:aink="http://schemas.microsoft.com/office/drawing/2016/ink" xmlns:am3d="http://schemas.microsoft.com/office/drawing/2017/model3d" xmlns:o="urn:schemas-microsoft-com:office:office" xmlns:oel="http://schemas.microsoft.com/office/2019/extlst" xmlns:r="http://schemas.openxmlformats.org/officeDocument/2006/relationships" xmlns:m="http://schemas.openxmlformats.org/officeDocument/2006/math" xmlns:v="urn:schemas-microsoft-com:vml" xmlns:wp14="http://schemas.microsoft.com/office/word/2010/wordprocessingDrawing" xmlns:wp="http://schemas.openxmlformats.org/drawingml/2006/wordprocessingDrawing" xmlns:w10="urn:schemas-microsoft-com:office:word" xmlns:w="http://schemas.openxmlformats.org/wordprocessingml/2006/main" xmlns:w14="http://schemas.microsoft.com/office/word/2010/wordml" xmlns:w15="http://schemas.microsoft.com/office/word/2012/wordml" xmlns:w16cex="http://schemas.microsoft.com/office/word/2018/wordml/cex" xmlns:w16cid="http://schemas.microsoft.com/office/word/2016/wordml/cid" xmlns:w16="http://schemas.microsoft.com/office/word/2018/wordml" xmlns:w16sdtdh="http://schemas.microsoft.com/office/word/2020/wordml/sdtdatahash" xmlns:w16se="http://schemas.microsoft.com/office/word/2015/wordml/symex" xmlns:wpg="http://schemas.microsoft.com/office/word/2010/wordprocessingGroup" xmlns:wpi="http://schemas.microsoft.com/office/word/2010/wordprocessingInk" xmlns:wne="http://schemas.microsoft.com/office/word/2006/wordml" xmlns:wps="http://schemas.microsoft.com/office/word/2010/wordprocessingShape" mc:Ignorable="w14 w15 w16se w16cid w16 w16cex w16sdtdh wp14">
+<w:footnotes xmlns:wpc="http://schemas.microsoft.com/office/word/2010/wordprocessingCanvas" xmlns:cx="http://schemas.microsoft.com/office/drawing/2014/chartex" xmlns:cx1="http://schemas.microsoft.com/office/drawing/2015/9/8/chartex" xmlns:cx2="http://schemas.microsoft.com/office/drawing/2015/10/21/chartex" xmlns:cx3="http://schemas.microsoft.com/office/drawing/2016/5/9/chartex" xmlns:cx4="http://schemas.microsoft.com/office/drawing/2016/5/10/chartex" xmlns:cx5="http://schemas.microsoft.com/office/drawing/2016/5/11/chartex" xmlns:cx6="http://schemas.microsoft.com/office/drawing/2016/5/12/chartex" xmlns:cx7="http://schemas.microsoft.com/office/drawing/2016/5/13/chartex" xmlns:cx8="http://schemas.microsoft.com/office/drawing/2016/5/14/chartex" xmlns:mc="http://schemas.openxmlformats.org/markup-compatibility/2006" xmlns:aink="http://schemas.microsoft.com/office/drawing/2016/ink" xmlns:am3d="http://schemas.microsoft.com/office/drawing/2017/model3d" xmlns:o="urn:schemas-microsoft-com:office:office" xmlns:oel="http://schemas.microsoft.com/office/2019/extlst" xmlns:r="http://schemas.openxmlformats.org/officeDocument/2006/relationships" xmlns:m="http://schemas.openxmlformats.org/officeDocument/2006/math" xmlns:v="urn:schemas-microsoft-com:vml" xmlns:wp14="http://schemas.microsoft.com/office/word/2010/wordprocessingDrawing" xmlns:wp="http://schemas.openxmlformats.org/drawingml/2006/wordprocessingDrawing" xmlns:w10="urn:schemas-microsoft-com:office:word" xmlns:w="http://schemas.openxmlformats.org/wordprocessingml/2006/main" xmlns:w14="http://schemas.microsoft.com/office/word/2010/wordml" xmlns:w15="http://schemas.microsoft.com/office/word/2012/wordml" xmlns:w16cex="http://schemas.microsoft.com/office/word/2018/wordml/cex" xmlns:w16cid="http://schemas.microsoft.com/office/word/2016/wordml/cid" xmlns:w16="http://schemas.microsoft.com/office/word/2018/wordml" xmlns:w16du="http://schemas.microsoft.com/office/word/2023/wordml/word16du" xmlns:w16sdtdh="http://schemas.microsoft.com/office/word/2020/wordml/sdtdatahash" xmlns:w16se="http://schemas.microsoft.com/office/word/2015/wordml/symex" xmlns:wpg="http://schemas.microsoft.com/office/word/2010/wordprocessingGroup" xmlns:wpi="http://schemas.microsoft.com/office/word/2010/wordprocessingInk" xmlns:wne="http://schemas.microsoft.com/office/word/2006/wordml" xmlns:wps="http://schemas.microsoft.com/office/word/2010/wordprocessingShape" mc:Ignorable="w14 w15 w16se w16cid w16 w16cex w16sdtdh w16du wp14">
   <w:footnote w:type="separator" w:id="-1">
     <w:p>
       <w:r>
@@ -4836,7 +4868,7 @@
 </file>
 
 <file path=word/header1.xml><?xml version="1.0" encoding="utf-8"?>
-<w:hdr xmlns:wpc="http://schemas.microsoft.com/office/word/2010/wordprocessingCanvas" xmlns:cx="http://schemas.microsoft.com/office/drawing/2014/chartex" xmlns:cx1="http://schemas.microsoft.com/office/drawing/2015/9/8/chartex" xmlns:cx2="http://schemas.microsoft.com/office/drawing/2015/10/21/chartex" xmlns:cx3="http://schemas.microsoft.com/office/drawing/2016/5/9/chartex" xmlns:cx4="http://schemas.microsoft.com/office/drawing/2016/5/10/chartex" xmlns:cx5="http://schemas.microsoft.com/office/drawing/2016/5/11/chartex" xmlns:cx6="http://schemas.microsoft.com/office/drawing/2016/5/12/chartex" xmlns:cx7="http://schemas.microsoft.com/office/drawing/2016/5/13/chartex" xmlns:cx8="http://schemas.microsoft.com/office/drawing/2016/5/14/chartex" xmlns:mc="http://schemas.openxmlformats.org/markup-compatibility/2006" xmlns:aink="http://schemas.microsoft.com/office/drawing/2016/ink" xmlns:am3d="http://schemas.microsoft.com/office/drawing/2017/model3d" xmlns:o="urn:schemas-microsoft-com:office:office" xmlns:oel="http://schemas.microsoft.com/office/2019/extlst" xmlns:r="http://schemas.openxmlformats.org/officeDocument/2006/relationships" xmlns:m="http://schemas.openxmlformats.org/officeDocument/2006/math" xmlns:v="urn:schemas-microsoft-com:vml" xmlns:wp14="http://schemas.microsoft.com/office/word/2010/wordprocessingDrawing" xmlns:wp="http://schemas.openxmlformats.org/drawingml/2006/wordprocessingDrawing" xmlns:w10="urn:schemas-microsoft-com:office:word" xmlns:w="http://schemas.openxmlformats.org/wordprocessingml/2006/main" xmlns:w14="http://schemas.microsoft.com/office/word/2010/wordml" xmlns:w15="http://schemas.microsoft.com/office/word/2012/wordml" xmlns:w16cex="http://schemas.microsoft.com/office/word/2018/wordml/cex" xmlns:w16cid="http://schemas.microsoft.com/office/word/2016/wordml/cid" xmlns:w16="http://schemas.microsoft.com/office/word/2018/wordml" xmlns:w16sdtdh="http://schemas.microsoft.com/office/word/2020/wordml/sdtdatahash" xmlns:w16se="http://schemas.microsoft.com/office/word/2015/wordml/symex" xmlns:wpg="http://schemas.microsoft.com/office/word/2010/wordprocessingGroup" xmlns:wpi="http://schemas.microsoft.com/office/word/2010/wordprocessingInk" xmlns:wne="http://schemas.microsoft.com/office/word/2006/wordml" xmlns:wps="http://schemas.microsoft.com/office/word/2010/wordprocessingShape" mc:Ignorable="w14 w15 w16se w16cid w16 w16cex w16sdtdh wp14">
+<w:hdr xmlns:wpc="http://schemas.microsoft.com/office/word/2010/wordprocessingCanvas" xmlns:cx="http://schemas.microsoft.com/office/drawing/2014/chartex" xmlns:cx1="http://schemas.microsoft.com/office/drawing/2015/9/8/chartex" xmlns:cx2="http://schemas.microsoft.com/office/drawing/2015/10/21/chartex" xmlns:cx3="http://schemas.microsoft.com/office/drawing/2016/5/9/chartex" xmlns:cx4="http://schemas.microsoft.com/office/drawing/2016/5/10/chartex" xmlns:cx5="http://schemas.microsoft.com/office/drawing/2016/5/11/chartex" xmlns:cx6="http://schemas.microsoft.com/office/drawing/2016/5/12/chartex" xmlns:cx7="http://schemas.microsoft.com/office/drawing/2016/5/13/chartex" xmlns:cx8="http://schemas.microsoft.com/office/drawing/2016/5/14/chartex" xmlns:mc="http://schemas.openxmlformats.org/markup-compatibility/2006" xmlns:aink="http://schemas.microsoft.com/office/drawing/2016/ink" xmlns:am3d="http://schemas.microsoft.com/office/drawing/2017/model3d" xmlns:o="urn:schemas-microsoft-com:office:office" xmlns:oel="http://schemas.microsoft.com/office/2019/extlst" xmlns:r="http://schemas.openxmlformats.org/officeDocument/2006/relationships" xmlns:m="http://schemas.openxmlformats.org/officeDocument/2006/math" xmlns:v="urn:schemas-microsoft-com:vml" xmlns:wp14="http://schemas.microsoft.com/office/word/2010/wordprocessingDrawing" xmlns:wp="http://schemas.openxmlformats.org/drawingml/2006/wordprocessingDrawing" xmlns:w10="urn:schemas-microsoft-com:office:word" xmlns:w="http://schemas.openxmlformats.org/wordprocessingml/2006/main" xmlns:w14="http://schemas.microsoft.com/office/word/2010/wordml" xmlns:w15="http://schemas.microsoft.com/office/word/2012/wordml" xmlns:w16cex="http://schemas.microsoft.com/office/word/2018/wordml/cex" xmlns:w16cid="http://schemas.microsoft.com/office/word/2016/wordml/cid" xmlns:w16="http://schemas.microsoft.com/office/word/2018/wordml" xmlns:w16du="http://schemas.microsoft.com/office/word/2023/wordml/word16du" xmlns:w16sdtdh="http://schemas.microsoft.com/office/word/2020/wordml/sdtdatahash" xmlns:w16se="http://schemas.microsoft.com/office/word/2015/wordml/symex" xmlns:wpg="http://schemas.microsoft.com/office/word/2010/wordprocessingGroup" xmlns:wpi="http://schemas.microsoft.com/office/word/2010/wordprocessingInk" xmlns:wne="http://schemas.microsoft.com/office/word/2006/wordml" xmlns:wps="http://schemas.microsoft.com/office/word/2010/wordprocessingShape" mc:Ignorable="w14 w15 w16se w16cid w16 w16cex w16sdtdh w16du wp14">
   <w:p>
     <w:pPr>
       <w:spacing w:after="200"/>
@@ -4847,7 +4879,7 @@
 </file>
 
 <file path=word/numbering.xml><?xml version="1.0" encoding="utf-8"?>
-<w:numbering xmlns:wpc="http://schemas.microsoft.com/office/word/2010/wordprocessingCanvas" xmlns:cx="http://schemas.microsoft.com/office/drawing/2014/chartex" xmlns:cx1="http://schemas.microsoft.com/office/drawing/2015/9/8/chartex" xmlns:cx2="http://schemas.microsoft.com/office/drawing/2015/10/21/chartex" xmlns:cx3="http://schemas.microsoft.com/office/drawing/2016/5/9/chartex" xmlns:cx4="http://schemas.microsoft.com/office/drawing/2016/5/10/chartex" xmlns:cx5="http://schemas.microsoft.com/office/drawing/2016/5/11/chartex" xmlns:cx6="http://schemas.microsoft.com/office/drawing/2016/5/12/chartex" xmlns:cx7="http://schemas.microsoft.com/office/drawing/2016/5/13/chartex" xmlns:cx8="http://schemas.microsoft.com/office/drawing/2016/5/14/chartex" xmlns:mc="http://schemas.openxmlformats.org/markup-compatibility/2006" xmlns:aink="http://schemas.microsoft.com/office/drawing/2016/ink" xmlns:am3d="http://schemas.microsoft.com/office/drawing/2017/model3d" xmlns:o="urn:schemas-microsoft-com:office:office" xmlns:oel="http://schemas.microsoft.com/office/2019/extlst" xmlns:r="http://schemas.openxmlformats.org/officeDocument/2006/relationships" xmlns:m="http://schemas.openxmlformats.org/officeDocument/2006/math" xmlns:v="urn:schemas-microsoft-com:vml" xmlns:wp14="http://schemas.microsoft.com/office/word/2010/wordprocessingDrawing" xmlns:wp="http://schemas.openxmlformats.org/drawingml/2006/wordprocessingDrawing" xmlns:w10="urn:schemas-microsoft-com:office:word" xmlns:w="http://schemas.openxmlformats.org/wordprocessingml/2006/main" xmlns:w14="http://schemas.microsoft.com/office/word/2010/wordml" xmlns:w15="http://schemas.microsoft.com/office/word/2012/wordml" xmlns:w16cex="http://schemas.microsoft.com/office/word/2018/wordml/cex" xmlns:w16cid="http://schemas.microsoft.com/office/word/2016/wordml/cid" xmlns:w16="http://schemas.microsoft.com/office/word/2018/wordml" xmlns:w16sdtdh="http://schemas.microsoft.com/office/word/2020/wordml/sdtdatahash" xmlns:w16se="http://schemas.microsoft.com/office/word/2015/wordml/symex" xmlns:wpg="http://schemas.microsoft.com/office/word/2010/wordprocessingGroup" xmlns:wpi="http://schemas.microsoft.com/office/word/2010/wordprocessingInk" xmlns:wne="http://schemas.microsoft.com/office/word/2006/wordml" xmlns:wps="http://schemas.microsoft.com/office/word/2010/wordprocessingShape" mc:Ignorable="w14 w15 w16se w16cid w16 w16cex w16sdtdh wp14">
+<w:numbering xmlns:wpc="http://schemas.microsoft.com/office/word/2010/wordprocessingCanvas" xmlns:cx="http://schemas.microsoft.com/office/drawing/2014/chartex" xmlns:cx1="http://schemas.microsoft.com/office/drawing/2015/9/8/chartex" xmlns:cx2="http://schemas.microsoft.com/office/drawing/2015/10/21/chartex" xmlns:cx3="http://schemas.microsoft.com/office/drawing/2016/5/9/chartex" xmlns:cx4="http://schemas.microsoft.com/office/drawing/2016/5/10/chartex" xmlns:cx5="http://schemas.microsoft.com/office/drawing/2016/5/11/chartex" xmlns:cx6="http://schemas.microsoft.com/office/drawing/2016/5/12/chartex" xmlns:cx7="http://schemas.microsoft.com/office/drawing/2016/5/13/chartex" xmlns:cx8="http://schemas.microsoft.com/office/drawing/2016/5/14/chartex" xmlns:mc="http://schemas.openxmlformats.org/markup-compatibility/2006" xmlns:aink="http://schemas.microsoft.com/office/drawing/2016/ink" xmlns:am3d="http://schemas.microsoft.com/office/drawing/2017/model3d" xmlns:o="urn:schemas-microsoft-com:office:office" xmlns:oel="http://schemas.microsoft.com/office/2019/extlst" xmlns:r="http://schemas.openxmlformats.org/officeDocument/2006/relationships" xmlns:m="http://schemas.openxmlformats.org/officeDocument/2006/math" xmlns:v="urn:schemas-microsoft-com:vml" xmlns:wp14="http://schemas.microsoft.com/office/word/2010/wordprocessingDrawing" xmlns:wp="http://schemas.openxmlformats.org/drawingml/2006/wordprocessingDrawing" xmlns:w10="urn:schemas-microsoft-com:office:word" xmlns:w="http://schemas.openxmlformats.org/wordprocessingml/2006/main" xmlns:w14="http://schemas.microsoft.com/office/word/2010/wordml" xmlns:w15="http://schemas.microsoft.com/office/word/2012/wordml" xmlns:w16cex="http://schemas.microsoft.com/office/word/2018/wordml/cex" xmlns:w16cid="http://schemas.microsoft.com/office/word/2016/wordml/cid" xmlns:w16="http://schemas.microsoft.com/office/word/2018/wordml" xmlns:w16du="http://schemas.microsoft.com/office/word/2023/wordml/word16du" xmlns:w16sdtdh="http://schemas.microsoft.com/office/word/2020/wordml/sdtdatahash" xmlns:w16se="http://schemas.microsoft.com/office/word/2015/wordml/symex" xmlns:wpg="http://schemas.microsoft.com/office/word/2010/wordprocessingGroup" xmlns:wpi="http://schemas.microsoft.com/office/word/2010/wordprocessingInk" xmlns:wne="http://schemas.microsoft.com/office/word/2006/wordml" xmlns:wps="http://schemas.microsoft.com/office/word/2010/wordprocessingShape" mc:Ignorable="w14 w15 w16se w16cid w16 w16cex w16sdtdh w16du wp14">
   <w:abstractNum w:abstractNumId="0" w15:restartNumberingAfterBreak="0">
     <w:nsid w:val="042D5B49"/>
     <w:multiLevelType w:val="multilevel"/>
@@ -7793,7 +7825,7 @@
 </file>
 
 <file path=word/styles.xml><?xml version="1.0" encoding="utf-8"?>
-<w:styles xmlns:mc="http://schemas.openxmlformats.org/markup-compatibility/2006" xmlns:r="http://schemas.openxmlformats.org/officeDocument/2006/relationships" xmlns:w="http://schemas.openxmlformats.org/wordprocessingml/2006/main" xmlns:w14="http://schemas.microsoft.com/office/word/2010/wordml" xmlns:w15="http://schemas.microsoft.com/office/word/2012/wordml" xmlns:w16cex="http://schemas.microsoft.com/office/word/2018/wordml/cex" xmlns:w16cid="http://schemas.microsoft.com/office/word/2016/wordml/cid" xmlns:w16="http://schemas.microsoft.com/office/word/2018/wordml" xmlns:w16sdtdh="http://schemas.microsoft.com/office/word/2020/wordml/sdtdatahash" xmlns:w16se="http://schemas.microsoft.com/office/word/2015/wordml/symex" mc:Ignorable="w14 w15 w16se w16cid w16 w16cex w16sdtdh">
+<w:styles xmlns:mc="http://schemas.openxmlformats.org/markup-compatibility/2006" xmlns:r="http://schemas.openxmlformats.org/officeDocument/2006/relationships" xmlns:w="http://schemas.openxmlformats.org/wordprocessingml/2006/main" xmlns:w14="http://schemas.microsoft.com/office/word/2010/wordml" xmlns:w15="http://schemas.microsoft.com/office/word/2012/wordml" xmlns:w16cex="http://schemas.microsoft.com/office/word/2018/wordml/cex" xmlns:w16cid="http://schemas.microsoft.com/office/word/2016/wordml/cid" xmlns:w16="http://schemas.microsoft.com/office/word/2018/wordml" xmlns:w16du="http://schemas.microsoft.com/office/word/2023/wordml/word16du" xmlns:w16sdtdh="http://schemas.microsoft.com/office/word/2020/wordml/sdtdatahash" xmlns:w16se="http://schemas.microsoft.com/office/word/2015/wordml/symex" mc:Ignorable="w14 w15 w16se w16cid w16 w16cex w16sdtdh w16du">
   <w:docDefaults>
     <w:rPrDefault>
       <w:rPr>
@@ -9012,6 +9044,25 @@
 </file>
 
 <file path=customXml/item1.xml><?xml version="1.0" encoding="utf-8"?>
+<p:properties xmlns:p="http://schemas.microsoft.com/office/2006/metadata/properties" xmlns:xsi="http://www.w3.org/2001/XMLSchema-instance" xmlns:pc="http://schemas.microsoft.com/office/infopath/2007/PartnerControls">
+  <documentManagement>
+    <Comments xmlns="c534d78a-cb69-4aca-a069-043e1704d47b" xsi:nil="true"/>
+    <SharedWithUsers xmlns="40cc8b17-6277-40d3-adb4-53037ef9c179">
+      <UserInfo>
+        <DisplayName/>
+        <AccountId xsi:nil="true"/>
+        <AccountType/>
+      </UserInfo>
+    </SharedWithUsers>
+  </documentManagement>
+</p:properties>
+</file>
+
+<file path=customXml/item2.xml><?xml version="1.0" encoding="utf-8"?>
+<b:Sources xmlns:b="http://schemas.openxmlformats.org/officeDocument/2006/bibliography" xmlns="http://schemas.openxmlformats.org/officeDocument/2006/bibliography" SelectedStyle="/APASixthEditionOfficeOnline.xsl" StyleName="APA" Version="6"/>
+</file>
+
+<file path=customXml/item3.xml><?xml version="1.0" encoding="utf-8"?>
 <ct:contentTypeSchema xmlns:ct="http://schemas.microsoft.com/office/2006/metadata/contentType" xmlns:ma="http://schemas.microsoft.com/office/2006/metadata/properties/metaAttributes" ct:_="" ma:_="" ma:contentTypeName="Document" ma:contentTypeID="0x010100F5CC0A6DD1FA224496921034181E8D3A" ma:contentTypeVersion="14" ma:contentTypeDescription="Create a new document." ma:contentTypeScope="" ma:versionID="ff6a6df06ef94ff418f3c8b370b904e6">
   <xsd:schema xmlns:xsd="http://www.w3.org/2001/XMLSchema" xmlns:xs="http://www.w3.org/2001/XMLSchema" xmlns:p="http://schemas.microsoft.com/office/2006/metadata/properties" xmlns:ns2="c534d78a-cb69-4aca-a069-043e1704d47b" xmlns:ns3="40cc8b17-6277-40d3-adb4-53037ef9c179" targetNamespace="http://schemas.microsoft.com/office/2006/metadata/properties" ma:root="true" ma:fieldsID="b2980321f430c580e134f30fce888d45" ns2:_="" ns3:_="">
     <xsd:import namespace="c534d78a-cb69-4aca-a069-043e1704d47b"/>
@@ -9236,7 +9287,7 @@
 </ct:contentTypeSchema>
 </file>
 
-<file path=customXml/item2.xml><?xml version="1.0" encoding="utf-8"?>
+<file path=customXml/item4.xml><?xml version="1.0" encoding="utf-8"?>
 <?mso-contentType ?>
 <FormTemplates xmlns="http://schemas.microsoft.com/sharepoint/v3/contenttype/forms">
   <Display>DocumentLibraryForm</Display>
@@ -9245,26 +9296,26 @@
 </FormTemplates>
 </file>
 
-<file path=customXml/item3.xml><?xml version="1.0" encoding="utf-8"?>
-<p:properties xmlns:p="http://schemas.microsoft.com/office/2006/metadata/properties" xmlns:xsi="http://www.w3.org/2001/XMLSchema-instance" xmlns:pc="http://schemas.microsoft.com/office/infopath/2007/PartnerControls">
-  <documentManagement>
-    <Comments xmlns="c534d78a-cb69-4aca-a069-043e1704d47b" xsi:nil="true"/>
-    <SharedWithUsers xmlns="40cc8b17-6277-40d3-adb4-53037ef9c179">
-      <UserInfo>
-        <DisplayName/>
-        <AccountId xsi:nil="true"/>
-        <AccountType/>
-      </UserInfo>
-    </SharedWithUsers>
-  </documentManagement>
-</p:properties>
+<file path=customXml/itemProps1.xml><?xml version="1.0" encoding="utf-8"?>
+<ds:datastoreItem xmlns:ds="http://schemas.openxmlformats.org/officeDocument/2006/customXml" ds:itemID="{3C31B74E-B801-4B52-B7BA-EA9BE36F272F}">
+  <ds:schemaRefs>
+    <ds:schemaRef ds:uri="http://schemas.microsoft.com/office/2006/metadata/properties"/>
+    <ds:schemaRef ds:uri="http://schemas.microsoft.com/office/infopath/2007/PartnerControls"/>
+    <ds:schemaRef ds:uri="c534d78a-cb69-4aca-a069-043e1704d47b"/>
+    <ds:schemaRef ds:uri="40cc8b17-6277-40d3-adb4-53037ef9c179"/>
+  </ds:schemaRefs>
+</ds:datastoreItem>
 </file>
 
-<file path=customXml/item4.xml><?xml version="1.0" encoding="utf-8"?>
-<b:Sources xmlns:b="http://schemas.openxmlformats.org/officeDocument/2006/bibliography" xmlns="http://schemas.openxmlformats.org/officeDocument/2006/bibliography" SelectedStyle="/APASixthEditionOfficeOnline.xsl" StyleName="APA" Version="6"/>
+<file path=customXml/itemProps2.xml><?xml version="1.0" encoding="utf-8"?>
+<ds:datastoreItem xmlns:ds="http://schemas.openxmlformats.org/officeDocument/2006/customXml" ds:itemID="{ADC17017-D038-47B4-883E-8E6EBCDB8FF6}">
+  <ds:schemaRefs>
+    <ds:schemaRef ds:uri="http://schemas.openxmlformats.org/officeDocument/2006/bibliography"/>
+  </ds:schemaRefs>
+</ds:datastoreItem>
 </file>
 
-<file path=customXml/itemProps1.xml><?xml version="1.0" encoding="utf-8"?>
+<file path=customXml/itemProps3.xml><?xml version="1.0" encoding="utf-8"?>
 <ds:datastoreItem xmlns:ds="http://schemas.openxmlformats.org/officeDocument/2006/customXml" ds:itemID="{7969A40B-FE12-4AEB-B998-3DC7F9AF79FD}">
   <ds:schemaRefs>
     <ds:schemaRef ds:uri="http://schemas.microsoft.com/office/2006/metadata/contentType"/>
@@ -9283,29 +9334,10 @@
 </ds:datastoreItem>
 </file>
 
-<file path=customXml/itemProps2.xml><?xml version="1.0" encoding="utf-8"?>
+<file path=customXml/itemProps4.xml><?xml version="1.0" encoding="utf-8"?>
 <ds:datastoreItem xmlns:ds="http://schemas.openxmlformats.org/officeDocument/2006/customXml" ds:itemID="{BDD9A1F8-243E-4DEE-9219-712EC0DB252F}">
   <ds:schemaRefs>
     <ds:schemaRef ds:uri="http://schemas.microsoft.com/sharepoint/v3/contenttype/forms"/>
   </ds:schemaRefs>
 </ds:datastoreItem>
-</file>
-
-<file path=customXml/itemProps3.xml><?xml version="1.0" encoding="utf-8"?>
-<ds:datastoreItem xmlns:ds="http://schemas.openxmlformats.org/officeDocument/2006/customXml" ds:itemID="{3C31B74E-B801-4B52-B7BA-EA9BE36F272F}">
-  <ds:schemaRefs>
-    <ds:schemaRef ds:uri="http://schemas.microsoft.com/office/2006/metadata/properties"/>
-    <ds:schemaRef ds:uri="http://schemas.microsoft.com/office/infopath/2007/PartnerControls"/>
-    <ds:schemaRef ds:uri="c534d78a-cb69-4aca-a069-043e1704d47b"/>
-    <ds:schemaRef ds:uri="40cc8b17-6277-40d3-adb4-53037ef9c179"/>
-  </ds:schemaRefs>
-</ds:datastoreItem>
-</file>
-
-<file path=customXml/itemProps4.xml><?xml version="1.0" encoding="utf-8"?>
-<ds:datastoreItem xmlns:ds="http://schemas.openxmlformats.org/officeDocument/2006/customXml" ds:itemID="{ADC17017-D038-47B4-883E-8E6EBCDB8FF6}">
-  <ds:schemaRefs>
-    <ds:schemaRef ds:uri="http://schemas.openxmlformats.org/officeDocument/2006/bibliography"/>
-  </ds:schemaRefs>
-</ds:datastoreItem>
 </file>
</xml_diff>